<commit_message>
fix(cifie): remove subtitle word count under title, keep word count under author name
</commit_message>
<xml_diff>
--- a/publications/book_chapters/2026_cifie_xai_fom7/drafts/v3_editorial_review/cifie_xai_fom7_2026-10-06.docx
+++ b/publications/book_chapters/2026_cifie_xai_fom7/drafts/v3_editorial_review/cifie_xai_fom7_2026-10-06.docx
@@ -13,19 +13,6 @@
           <w:color w:val="000000"/>
         </w:rPr>
         <w:t xml:space="preserve">De la explicación a la evidencia: fundamentos, aplicaciones y evaluación auditable de la inteligencia artificial explicable</w:t>
-      </w:r>
-    </w:p>
-    <w:p>
-      <w:pPr>
-        <w:pStyle w:val="Subtitle"/>
-        <w:spacing w:line="360" w:lineRule="auto"/>
-        <w:jc w:val="both"/>
-      </w:pPr>
-      <w:r>
-        <w:rPr>
-          <w:color w:val="000000"/>
-        </w:rPr>
-        <w:t xml:space="preserve">Recuento total de palabras: 7,793 palabras</w:t>
       </w:r>
     </w:p>
     <w:p>

</xml_diff>